<commit_message>
Passport 3: lean extraction, deterministic evidence linking, semantic sidecar
Restore lean extraction to the shared schema: evidence_quote is no longer a
required extraction field, so the weak-model regression it caused on the v2 path
is removed. Evidence is anchored after extraction by a deterministic pass
(exact-substring and content-overlap), with an optional bounded model fallback
behind evidence_linking="model".

Add temporal valid-time ordered context to the ledger, and a disposable semantic
sidecar: field vectors bound to record revision and embedding model, policy
filtering before dense scoring, and BM25F+dense fusion through weighted
reciprocal rank fusion. Stale vectors drop on incremental refresh. The passport
stays usable with no sidecar and no embedder.

197 tests passed, ruff clean.
</commit_message>
<xml_diff>
--- a/docs/SozoGraph_Portable_Memory_Passport_Engineering_Plan.docx
+++ b/docs/SozoGraph_Portable_Memory_Passport_Engineering_Plan.docx
@@ -31,7 +31,7 @@
         <w:pStyle w:val="Smalllabel"/>
       </w:pPr>
       <w:r>
-        <w:t>5 September 2026</w:t>
+        <w:t>6 September 2026</w:t>
       </w:r>
     </w:p>
     <w:p>
@@ -1422,6 +1422,38 @@
             </w:pPr>
             <w:r>
               <w:t>22</w:t>
+            </w:r>
+          </w:p>
+        </w:tc>
+      </w:tr>
+      <w:tr>
+        <w:tc>
+          <w:tcPr>
+            <w:tcW w:type="dxa" w:w="3293"/>
+          </w:tcPr>
+          <w:p>
+            <w:r>
+              <w:t>12</w:t>
+            </w:r>
+          </w:p>
+        </w:tc>
+        <w:tc>
+          <w:tcPr>
+            <w:tcW w:type="dxa" w:w="3293"/>
+          </w:tcPr>
+          <w:p>
+            <w:r>
+              <w:t>Vector meaning strategy</w:t>
+            </w:r>
+          </w:p>
+        </w:tc>
+        <w:tc>
+          <w:tcPr>
+            <w:tcW w:type="dxa" w:w="3293"/>
+          </w:tcPr>
+          <w:p>
+            <w:r>
+              <w:t>24</w:t>
             </w:r>
           </w:p>
         </w:tc>
@@ -18235,14 +18267,8 @@
             </w:tcMar>
           </w:tcPr>
           <w:p>
-            <w:pPr>
-              <w:jc w:val="left"/>
-            </w:pPr>
-            <w:r>
-              <w:rPr>
-                <w:sz w:val="17"/>
-              </w:rPr>
-              <w:t>The extractor requests verbatim support quotes. Verified quotes become exact character and UTF-8 byte spans.</w:t>
+            <w:r>
+              <w:t>Lean extraction stays focused on memory content. Local alignment anchors exact spans. An optional bounded pass links unresolved evidence.</w:t>
             </w:r>
           </w:p>
         </w:tc>
@@ -18572,7 +18598,7 @@
         <w:pStyle w:val="ListBullet"/>
       </w:pPr>
       <w:r>
-        <w:t>188 tests passed.</w:t>
+        <w:t>197 tests passed.</w:t>
       </w:r>
     </w:p>
     <w:p>
@@ -18604,7 +18630,7 @@
         <w:pStyle w:val="ListBullet"/>
       </w:pPr>
       <w:r>
-        <w:t>Twenty-seven Passport 3 tests cover exact evidence, Unicode coordinates, replay, bitemporal revisions, replica convergence, stale deletion, policy filtering, failure isolation, file round trips, and tamper detection.</w:t>
+        <w:t>Passport 3 tests now cover lean extraction, exact evidence, Unicode coordinates, replay, bitemporal revisions, replica convergence, stale deletion, policy filtering, timeline rendering, semantic revision gates, hybrid retrieval, file round trips, and tamper detection.</w:t>
       </w:r>
     </w:p>
     <w:p>
@@ -18659,7 +18685,7 @@
         <w:pStyle w:val="ListBullet"/>
       </w:pPr>
       <w:r>
-        <w:t>Add disposable graph and dense retrieval sidecars, temporal query parsing, learned reranking, and diversity selection.</w:t>
+        <w:t>Add the disposable graph sidecar, learned late-interaction reranking, and diversity selection.</w:t>
       </w:r>
     </w:p>
     <w:p>
@@ -18692,6 +18718,999 @@
         <w:t>Use SozoGraph.ingest_v3 for direct event-ledger ingestion. Pass the returned MemoryPassport back into the method for incremental updates. Use Passport.to_v3 for an offline snapshot upgrade. SozoGraph.ingest remains the stable Passport 2.1 path.</w:t>
       </w:r>
     </w:p>
+    <w:p>
+      <w:pPr>
+        <w:pStyle w:val="Heading1"/>
+        <w:keepNext/>
+      </w:pPr>
+      <w:r>
+        <w:t>12 Vector meaning strategy</w:t>
+      </w:r>
+    </w:p>
+    <w:p>
+      <w:r>
+        <w:t>The decision is to keep meaning outside the canonical passport. The passport stores auditable claims. A revision-bound sidecar stores geometry. BM25F and vectors generate candidates together. Late interaction reranks the hard cases. Valid time orders the final evidence.</w:t>
+      </w:r>
+    </w:p>
+    <w:p>
+      <w:r>
+        <w:t>The benchmark result sets the immediate priority. Required evidence quotes reduced the Passport 2 path from 25.4 percent to 21.0 percent. Temporal accuracy fell from 28 percent to 14 percent. The ledger path reached 19.8 percent on eight conversations and raised matched multi-hop accuracy from 9 percent to 15 percent. The extractor now writes meaning. Evidence linking now runs after extraction.</w:t>
+      </w:r>
+    </w:p>
+    <w:p>
+      <w:pPr>
+        <w:pStyle w:val="Heading2"/>
+        <w:keepNext/>
+      </w:pPr>
+      <w:r>
+        <w:t>Architecture</w:t>
+      </w:r>
+    </w:p>
+    <w:tbl>
+      <w:tblPr>
+        <w:tblW w:type="auto" w:w="0"/>
+        <w:tblLayout w:type="fixed"/>
+        <w:tblLook w:firstColumn="1" w:firstRow="1" w:lastColumn="0" w:lastRow="0" w:noHBand="0" w:noVBand="1" w:val="04A0"/>
+        <w:tblBorders>
+          <w:top w:val="single" w:sz="4" w:color="D9D9D9"/>
+          <w:left w:val="single" w:sz="4" w:color="D9D9D9"/>
+          <w:bottom w:val="single" w:sz="4" w:color="D9D9D9"/>
+          <w:right w:val="single" w:sz="4" w:color="D9D9D9"/>
+          <w:insideH w:val="single" w:sz="4" w:color="D9D9D9"/>
+          <w:insideV w:val="single" w:sz="4" w:color="D9D9D9"/>
+        </w:tblBorders>
+      </w:tblPr>
+      <w:tblGrid>
+        <w:gridCol w:w="2469"/>
+        <w:gridCol w:w="2469"/>
+        <w:gridCol w:w="2469"/>
+        <w:gridCol w:w="2469"/>
+      </w:tblGrid>
+      <w:tr>
+        <w:tc>
+          <w:tcPr>
+            <w:tcW w:type="dxa" w:w="1224"/>
+            <w:shd w:fill="1F4E78"/>
+            <w:tcMar>
+              <w:top w:w="110" w:type="dxa"/>
+              <w:start w:w="110" w:type="dxa"/>
+              <w:bottom w:w="110" w:type="dxa"/>
+              <w:end w:w="110" w:type="dxa"/>
+            </w:tcMar>
+            <w:vAlign w:val="center"/>
+          </w:tcPr>
+          <w:p>
+            <w:r>
+              <w:rPr>
+                <w:b/>
+                <w:color w:val="FFFFFF"/>
+                <w:sz w:val="17"/>
+              </w:rPr>
+              <w:t>Layer</w:t>
+            </w:r>
+          </w:p>
+        </w:tc>
+        <w:tc>
+          <w:tcPr>
+            <w:tcW w:type="dxa" w:w="1800"/>
+            <w:shd w:fill="1F4E78"/>
+            <w:tcMar>
+              <w:top w:w="110" w:type="dxa"/>
+              <w:start w:w="110" w:type="dxa"/>
+              <w:bottom w:w="110" w:type="dxa"/>
+              <w:end w:w="110" w:type="dxa"/>
+            </w:tcMar>
+            <w:vAlign w:val="center"/>
+          </w:tcPr>
+          <w:p>
+            <w:r>
+              <w:rPr>
+                <w:b/>
+                <w:color w:val="FFFFFF"/>
+                <w:sz w:val="17"/>
+              </w:rPr>
+              <w:t>Mechanism</w:t>
+            </w:r>
+          </w:p>
+        </w:tc>
+        <w:tc>
+          <w:tcPr>
+            <w:tcW w:type="dxa" w:w="4104"/>
+            <w:shd w:fill="1F4E78"/>
+            <w:tcMar>
+              <w:top w:w="110" w:type="dxa"/>
+              <w:start w:w="110" w:type="dxa"/>
+              <w:bottom w:w="110" w:type="dxa"/>
+              <w:end w:w="110" w:type="dxa"/>
+            </w:tcMar>
+            <w:vAlign w:val="center"/>
+          </w:tcPr>
+          <w:p>
+            <w:r>
+              <w:rPr>
+                <w:b/>
+                <w:color w:val="FFFFFF"/>
+                <w:sz w:val="17"/>
+              </w:rPr>
+              <w:t>Stored form</w:t>
+            </w:r>
+          </w:p>
+        </w:tc>
+        <w:tc>
+          <w:tcPr>
+            <w:tcW w:type="dxa" w:w="1800"/>
+            <w:shd w:fill="1F4E78"/>
+            <w:tcMar>
+              <w:top w:w="110" w:type="dxa"/>
+              <w:start w:w="110" w:type="dxa"/>
+              <w:bottom w:w="110" w:type="dxa"/>
+              <w:end w:w="110" w:type="dxa"/>
+            </w:tcMar>
+            <w:vAlign w:val="center"/>
+          </w:tcPr>
+          <w:p>
+            <w:r>
+              <w:rPr>
+                <w:b/>
+                <w:color w:val="FFFFFF"/>
+                <w:sz w:val="17"/>
+              </w:rPr>
+              <w:t>Job</w:t>
+            </w:r>
+          </w:p>
+        </w:tc>
+      </w:tr>
+      <w:tr>
+        <w:tc>
+          <w:tcPr>
+            <w:tcW w:type="dxa" w:w="1224"/>
+            <w:tcMar>
+              <w:top w:w="110" w:type="dxa"/>
+              <w:start w:w="110" w:type="dxa"/>
+              <w:bottom w:w="110" w:type="dxa"/>
+              <w:end w:w="110" w:type="dxa"/>
+            </w:tcMar>
+            <w:vAlign w:val="center"/>
+          </w:tcPr>
+          <w:p>
+            <w:r>
+              <w:rPr>
+                <w:sz w:val="16"/>
+              </w:rPr>
+              <w:t>Canonical</w:t>
+            </w:r>
+          </w:p>
+        </w:tc>
+        <w:tc>
+          <w:tcPr>
+            <w:tcW w:type="dxa" w:w="1800"/>
+            <w:tcMar>
+              <w:top w:w="110" w:type="dxa"/>
+              <w:start w:w="110" w:type="dxa"/>
+              <w:bottom w:w="110" w:type="dxa"/>
+              <w:end w:w="110" w:type="dxa"/>
+            </w:tcMar>
+            <w:vAlign w:val="center"/>
+          </w:tcPr>
+          <w:p>
+            <w:r>
+              <w:rPr>
+                <w:sz w:val="16"/>
+              </w:rPr>
+              <w:t>Passport 3 ledger</w:t>
+            </w:r>
+          </w:p>
+        </w:tc>
+        <w:tc>
+          <w:tcPr>
+            <w:tcW w:type="dxa" w:w="4104"/>
+            <w:tcMar>
+              <w:top w:w="110" w:type="dxa"/>
+              <w:start w:w="110" w:type="dxa"/>
+              <w:bottom w:w="110" w:type="dxa"/>
+              <w:end w:w="110" w:type="dxa"/>
+            </w:tcMar>
+            <w:vAlign w:val="center"/>
+          </w:tcPr>
+          <w:p>
+            <w:r>
+              <w:rPr>
+                <w:sz w:val="16"/>
+              </w:rPr>
+              <w:t>Claims, evidence, time, policy, revision lineage</w:t>
+            </w:r>
+          </w:p>
+        </w:tc>
+        <w:tc>
+          <w:tcPr>
+            <w:tcW w:type="dxa" w:w="1800"/>
+            <w:tcMar>
+              <w:top w:w="110" w:type="dxa"/>
+              <w:start w:w="110" w:type="dxa"/>
+              <w:bottom w:w="110" w:type="dxa"/>
+              <w:end w:w="110" w:type="dxa"/>
+            </w:tcMar>
+            <w:vAlign w:val="center"/>
+          </w:tcPr>
+          <w:p>
+            <w:r>
+              <w:rPr>
+                <w:sz w:val="16"/>
+              </w:rPr>
+              <w:t>Portable truth</w:t>
+            </w:r>
+          </w:p>
+        </w:tc>
+      </w:tr>
+      <w:tr>
+        <w:tc>
+          <w:tcPr>
+            <w:tcW w:type="dxa" w:w="1224"/>
+            <w:shd w:fill="F2F6FA"/>
+            <w:tcMar>
+              <w:top w:w="110" w:type="dxa"/>
+              <w:start w:w="110" w:type="dxa"/>
+              <w:bottom w:w="110" w:type="dxa"/>
+              <w:end w:w="110" w:type="dxa"/>
+            </w:tcMar>
+            <w:vAlign w:val="center"/>
+          </w:tcPr>
+          <w:p>
+            <w:r>
+              <w:rPr>
+                <w:sz w:val="16"/>
+              </w:rPr>
+              <w:t>Recall one</w:t>
+            </w:r>
+          </w:p>
+        </w:tc>
+        <w:tc>
+          <w:tcPr>
+            <w:tcW w:type="dxa" w:w="1800"/>
+            <w:shd w:fill="F2F6FA"/>
+            <w:tcMar>
+              <w:top w:w="110" w:type="dxa"/>
+              <w:start w:w="110" w:type="dxa"/>
+              <w:bottom w:w="110" w:type="dxa"/>
+              <w:end w:w="110" w:type="dxa"/>
+            </w:tcMar>
+            <w:vAlign w:val="center"/>
+          </w:tcPr>
+          <w:p>
+            <w:r>
+              <w:rPr>
+                <w:sz w:val="16"/>
+              </w:rPr>
+              <w:t>BM25F</w:t>
+            </w:r>
+          </w:p>
+        </w:tc>
+        <w:tc>
+          <w:tcPr>
+            <w:tcW w:type="dxa" w:w="4104"/>
+            <w:shd w:fill="F2F6FA"/>
+            <w:tcMar>
+              <w:top w:w="110" w:type="dxa"/>
+              <w:start w:w="110" w:type="dxa"/>
+              <w:bottom w:w="110" w:type="dxa"/>
+              <w:end w:w="110" w:type="dxa"/>
+            </w:tcMar>
+            <w:vAlign w:val="center"/>
+          </w:tcPr>
+          <w:p>
+            <w:r>
+              <w:rPr>
+                <w:sz w:val="16"/>
+              </w:rPr>
+              <w:t>Keys, values, text, dates, evidence</w:t>
+            </w:r>
+          </w:p>
+        </w:tc>
+        <w:tc>
+          <w:tcPr>
+            <w:tcW w:type="dxa" w:w="1800"/>
+            <w:shd w:fill="F2F6FA"/>
+            <w:tcMar>
+              <w:top w:w="110" w:type="dxa"/>
+              <w:start w:w="110" w:type="dxa"/>
+              <w:bottom w:w="110" w:type="dxa"/>
+              <w:end w:w="110" w:type="dxa"/>
+            </w:tcMar>
+            <w:vAlign w:val="center"/>
+          </w:tcPr>
+          <w:p>
+            <w:r>
+              <w:rPr>
+                <w:sz w:val="16"/>
+              </w:rPr>
+              <w:t>Exact terms</w:t>
+            </w:r>
+          </w:p>
+        </w:tc>
+      </w:tr>
+      <w:tr>
+        <w:tc>
+          <w:tcPr>
+            <w:tcW w:type="dxa" w:w="1224"/>
+            <w:tcMar>
+              <w:top w:w="110" w:type="dxa"/>
+              <w:start w:w="110" w:type="dxa"/>
+              <w:bottom w:w="110" w:type="dxa"/>
+              <w:end w:w="110" w:type="dxa"/>
+            </w:tcMar>
+            <w:vAlign w:val="center"/>
+          </w:tcPr>
+          <w:p>
+            <w:r>
+              <w:rPr>
+                <w:sz w:val="16"/>
+              </w:rPr>
+              <w:t>Recall two</w:t>
+            </w:r>
+          </w:p>
+        </w:tc>
+        <w:tc>
+          <w:tcPr>
+            <w:tcW w:type="dxa" w:w="1800"/>
+            <w:tcMar>
+              <w:top w:w="110" w:type="dxa"/>
+              <w:start w:w="110" w:type="dxa"/>
+              <w:bottom w:w="110" w:type="dxa"/>
+              <w:end w:w="110" w:type="dxa"/>
+            </w:tcMar>
+            <w:vAlign w:val="center"/>
+          </w:tcPr>
+          <w:p>
+            <w:r>
+              <w:rPr>
+                <w:sz w:val="16"/>
+              </w:rPr>
+              <w:t>Field vectors</w:t>
+            </w:r>
+          </w:p>
+        </w:tc>
+        <w:tc>
+          <w:tcPr>
+            <w:tcW w:type="dxa" w:w="4104"/>
+            <w:tcMar>
+              <w:top w:w="110" w:type="dxa"/>
+              <w:start w:w="110" w:type="dxa"/>
+              <w:bottom w:w="110" w:type="dxa"/>
+              <w:end w:w="110" w:type="dxa"/>
+            </w:tcMar>
+            <w:vAlign w:val="center"/>
+          </w:tcPr>
+          <w:p>
+            <w:r>
+              <w:rPr>
+                <w:sz w:val="16"/>
+              </w:rPr>
+              <w:t>One normalized vector per semantic field</w:t>
+            </w:r>
+          </w:p>
+        </w:tc>
+        <w:tc>
+          <w:tcPr>
+            <w:tcW w:type="dxa" w:w="1800"/>
+            <w:tcMar>
+              <w:top w:w="110" w:type="dxa"/>
+              <w:start w:w="110" w:type="dxa"/>
+              <w:bottom w:w="110" w:type="dxa"/>
+              <w:end w:w="110" w:type="dxa"/>
+            </w:tcMar>
+            <w:vAlign w:val="center"/>
+          </w:tcPr>
+          <w:p>
+            <w:r>
+              <w:rPr>
+                <w:sz w:val="16"/>
+              </w:rPr>
+              <w:t>Paraphrases</w:t>
+            </w:r>
+          </w:p>
+        </w:tc>
+      </w:tr>
+      <w:tr>
+        <w:tc>
+          <w:tcPr>
+            <w:tcW w:type="dxa" w:w="1224"/>
+            <w:shd w:fill="F2F6FA"/>
+            <w:tcMar>
+              <w:top w:w="110" w:type="dxa"/>
+              <w:start w:w="110" w:type="dxa"/>
+              <w:bottom w:w="110" w:type="dxa"/>
+              <w:end w:w="110" w:type="dxa"/>
+            </w:tcMar>
+            <w:vAlign w:val="center"/>
+          </w:tcPr>
+          <w:p>
+            <w:r>
+              <w:rPr>
+                <w:sz w:val="16"/>
+              </w:rPr>
+              <w:t>Rerank</w:t>
+            </w:r>
+          </w:p>
+        </w:tc>
+        <w:tc>
+          <w:tcPr>
+            <w:tcW w:type="dxa" w:w="1800"/>
+            <w:shd w:fill="F2F6FA"/>
+            <w:tcMar>
+              <w:top w:w="110" w:type="dxa"/>
+              <w:start w:w="110" w:type="dxa"/>
+              <w:bottom w:w="110" w:type="dxa"/>
+              <w:end w:w="110" w:type="dxa"/>
+            </w:tcMar>
+            <w:vAlign w:val="center"/>
+          </w:tcPr>
+          <w:p>
+            <w:r>
+              <w:rPr>
+                <w:sz w:val="16"/>
+              </w:rPr>
+              <w:t>Late interaction</w:t>
+            </w:r>
+          </w:p>
+        </w:tc>
+        <w:tc>
+          <w:tcPr>
+            <w:tcW w:type="dxa" w:w="4104"/>
+            <w:shd w:fill="F2F6FA"/>
+            <w:tcMar>
+              <w:top w:w="110" w:type="dxa"/>
+              <w:start w:w="110" w:type="dxa"/>
+              <w:bottom w:w="110" w:type="dxa"/>
+              <w:end w:w="110" w:type="dxa"/>
+            </w:tcMar>
+            <w:vAlign w:val="center"/>
+          </w:tcPr>
+          <w:p>
+            <w:r>
+              <w:rPr>
+                <w:sz w:val="16"/>
+              </w:rPr>
+              <w:t>Token vectors for the hard candidate set</w:t>
+            </w:r>
+          </w:p>
+        </w:tc>
+        <w:tc>
+          <w:tcPr>
+            <w:tcW w:type="dxa" w:w="1800"/>
+            <w:shd w:fill="F2F6FA"/>
+            <w:tcMar>
+              <w:top w:w="110" w:type="dxa"/>
+              <w:start w:w="110" w:type="dxa"/>
+              <w:bottom w:w="110" w:type="dxa"/>
+              <w:end w:w="110" w:type="dxa"/>
+            </w:tcMar>
+            <w:vAlign w:val="center"/>
+          </w:tcPr>
+          <w:p>
+            <w:r>
+              <w:rPr>
+                <w:sz w:val="16"/>
+              </w:rPr>
+              <w:t>Fine meaning</w:t>
+            </w:r>
+          </w:p>
+        </w:tc>
+      </w:tr>
+      <w:tr>
+        <w:tc>
+          <w:tcPr>
+            <w:tcW w:type="dxa" w:w="1224"/>
+            <w:tcMar>
+              <w:top w:w="110" w:type="dxa"/>
+              <w:start w:w="110" w:type="dxa"/>
+              <w:bottom w:w="110" w:type="dxa"/>
+              <w:end w:w="110" w:type="dxa"/>
+            </w:tcMar>
+            <w:vAlign w:val="center"/>
+          </w:tcPr>
+          <w:p>
+            <w:r>
+              <w:rPr>
+                <w:sz w:val="16"/>
+              </w:rPr>
+              <w:t>Pack</w:t>
+            </w:r>
+          </w:p>
+        </w:tc>
+        <w:tc>
+          <w:tcPr>
+            <w:tcW w:type="dxa" w:w="1800"/>
+            <w:tcMar>
+              <w:top w:w="110" w:type="dxa"/>
+              <w:start w:w="110" w:type="dxa"/>
+              <w:bottom w:w="110" w:type="dxa"/>
+              <w:end w:w="110" w:type="dxa"/>
+            </w:tcMar>
+            <w:vAlign w:val="center"/>
+          </w:tcPr>
+          <w:p>
+            <w:r>
+              <w:rPr>
+                <w:sz w:val="16"/>
+              </w:rPr>
+              <w:t>Timeline and diversity</w:t>
+            </w:r>
+          </w:p>
+        </w:tc>
+        <w:tc>
+          <w:tcPr>
+            <w:tcW w:type="dxa" w:w="4104"/>
+            <w:tcMar>
+              <w:top w:w="110" w:type="dxa"/>
+              <w:start w:w="110" w:type="dxa"/>
+              <w:bottom w:w="110" w:type="dxa"/>
+              <w:end w:w="110" w:type="dxa"/>
+            </w:tcMar>
+            <w:vAlign w:val="center"/>
+          </w:tcPr>
+          <w:p>
+            <w:r>
+              <w:rPr>
+                <w:sz w:val="16"/>
+              </w:rPr>
+              <w:t>Valid-time order and coverage</w:t>
+            </w:r>
+          </w:p>
+        </w:tc>
+        <w:tc>
+          <w:tcPr>
+            <w:tcW w:type="dxa" w:w="1800"/>
+            <w:tcMar>
+              <w:top w:w="110" w:type="dxa"/>
+              <w:start w:w="110" w:type="dxa"/>
+              <w:bottom w:w="110" w:type="dxa"/>
+              <w:end w:w="110" w:type="dxa"/>
+            </w:tcMar>
+            <w:vAlign w:val="center"/>
+          </w:tcPr>
+          <w:p>
+            <w:r>
+              <w:rPr>
+                <w:sz w:val="16"/>
+              </w:rPr>
+              <w:t>Answer context</w:t>
+            </w:r>
+          </w:p>
+        </w:tc>
+      </w:tr>
+    </w:tbl>
+    <w:p>
+      <w:pPr>
+        <w:spacing w:before="140"/>
+      </w:pPr>
+      <w:r>
+        <w:t>Each vector entry carries the record ID, record revision hash, field name, model ID, and normalized vector. A changed claim invalidates its old vectors. A different model ID requires a new sidecar. Policy filtering runs before dense scoring. The passport remains readable and searchable when the sidecar is absent.</w:t>
+      </w:r>
+    </w:p>
+    <w:p>
+      <w:pPr>
+        <w:keepLines/>
+        <w:jc w:val="center"/>
+      </w:pPr>
+      <m:oMathPara>
+        <m:oMath>
+          <m:r>
+            <m:rPr>
+              <m:nor/>
+            </m:rPr>
+            <m:t>Ssem(q,i) = 1[h_i = h(L_i)] max_f w_f cos(e_q, e_i,f)</m:t>
+          </m:r>
+        </m:oMath>
+      </m:oMathPara>
+    </w:p>
+    <w:p>
+      <w:pPr>
+        <w:spacing w:after="160"/>
+        <w:jc w:val="center"/>
+      </w:pPr>
+      <w:r>
+        <w:rPr>
+          <w:i/>
+          <w:color w:val="5B6573"/>
+          <w:sz w:val="17"/>
+        </w:rPr>
+        <w:t>Revision-gated semantic field score. L is the current ledger state and h is the revision hash.</w:t>
+      </w:r>
+    </w:p>
+    <w:p>
+      <w:pPr>
+        <w:pStyle w:val="Heading2"/>
+        <w:keepNext/>
+      </w:pPr>
+      <w:r>
+        <w:t>Meaning inside an LLM</w:t>
+      </w:r>
+    </w:p>
+    <w:p>
+      <w:r>
+        <w:t>Raw decoder hidden states are a weak retrieval contract. Causal masking and next-token training shape them for generation. Representation tuning gives the geometry a retrieval objective. LLM2Vec removes causal masking and adds masked-token and contrastive training. NV-Embed adds latent attention pooling and reports gains over mean and last-token pooling. GritLM trains one model for generation and embedding through instructions.</w:t>
+      </w:r>
+    </w:p>
+    <w:p>
+      <w:r>
+        <w:t>The operating choice is an instruction-tuned embedding model built from an LLM backbone. Qwen3 Embedding offers 0.6B, 4B, and 8B embedding and reranking variants. Start with 0.6B for portable CPU and edge tests. Use 4B for the quality line. Reserve 8B for the accuracy ceiling. Use explicit query and document instructions. Conversational noise tests belong in the release gate.</w:t>
+      </w:r>
+    </w:p>
+    <w:p>
+      <w:pPr>
+        <w:pStyle w:val="Heading2"/>
+        <w:keepNext/>
+      </w:pPr>
+      <w:r>
+        <w:t>Retrieval mathematics</w:t>
+      </w:r>
+    </w:p>
+    <w:p>
+      <w:r>
+        <w:t>Single-vector retrieval is the fast candidate layer. Field-level MaxSim preserves the strongest semantic field. Weighted reciprocal rank fusion joins its rank with BM25F. Late interaction runs on the short list.</w:t>
+      </w:r>
+    </w:p>
+    <w:p>
+      <w:pPr>
+        <w:keepLines/>
+        <w:jc w:val="center"/>
+        <w:keepNext/>
+      </w:pPr>
+      <m:oMathPara>
+        <m:oMath>
+          <m:r>
+            <m:rPr>
+              <m:nor/>
+            </m:rPr>
+            <m:t>SLI(q,i) = sum_a max_b e_q,a^T e_i,b</m:t>
+          </m:r>
+        </m:oMath>
+      </m:oMathPara>
+    </w:p>
+    <w:p>
+      <w:pPr>
+        <w:spacing w:after="160"/>
+        <w:jc w:val="center"/>
+      </w:pPr>
+      <w:r>
+        <w:rPr>
+          <w:i/>
+          <w:color w:val="5B6573"/>
+          <w:sz w:val="17"/>
+        </w:rPr>
+        <w:t>ColBERT late interaction score.</w:t>
+      </w:r>
+    </w:p>
+    <w:p>
+      <w:pPr>
+        <w:keepLines/>
+        <w:jc w:val="center"/>
+      </w:pPr>
+      <m:oMathPara>
+        <m:oMath>
+          <m:r>
+            <m:rPr>
+              <m:nor/>
+            </m:rPr>
+            <m:t>LNCE = -log exp(sim(q,d+)/tau) / [exp(sim(q,d+)/tau) + sum_d- exp(sim(q,d-)/tau)]</m:t>
+          </m:r>
+        </m:oMath>
+      </m:oMathPara>
+    </w:p>
+    <w:p>
+      <w:pPr>
+        <w:spacing w:after="160"/>
+        <w:jc w:val="center"/>
+      </w:pPr>
+      <w:r>
+        <w:rPr>
+          <w:i/>
+          <w:color w:val="5B6573"/>
+          <w:sz w:val="17"/>
+        </w:rPr>
+        <w:t>Contrastive retrieval loss with positive evidence and hard negatives.</w:t>
+      </w:r>
+    </w:p>
+    <w:p>
+      <w:pPr>
+        <w:keepLines/>
+        <w:jc w:val="center"/>
+      </w:pPr>
+      <m:oMathPara>
+        <m:oMath>
+          <m:r>
+            <m:rPr>
+              <m:nor/>
+            </m:rPr>
+            <m:t>LMRL = sum_m lambda_m LNCE(norm(e_1:m))</m:t>
+          </m:r>
+        </m:oMath>
+      </m:oMathPara>
+    </w:p>
+    <w:p>
+      <w:pPr>
+        <w:spacing w:after="160"/>
+        <w:jc w:val="center"/>
+      </w:pPr>
+      <w:r>
+        <w:rPr>
+          <w:i/>
+          <w:color w:val="5B6573"/>
+          <w:sz w:val="17"/>
+        </w:rPr>
+        <w:t>Matryoshka loss across nested prefix dimensions.</w:t>
+      </w:r>
+    </w:p>
+    <w:p>
+      <w:pPr>
+        <w:keepLines/>
+        <w:jc w:val="center"/>
+      </w:pPr>
+      <m:oMathPara>
+        <m:oMath>
+          <m:r>
+            <m:rPr>
+              <m:nor/>
+            </m:rPr>
+            <m:t>J = Qanswer - lambda_L Lp95 - lambda_B Bindex - lambda_C Cembed; R@k &gt;= r0; P = 1</m:t>
+          </m:r>
+        </m:oMath>
+      </m:oMathPara>
+    </w:p>
+    <w:p>
+      <w:pPr>
+        <w:spacing w:after="160"/>
+        <w:jc w:val="center"/>
+      </w:pPr>
+      <w:r>
+        <w:rPr>
+          <w:i/>
+          <w:color w:val="5B6573"/>
+          <w:sz w:val="17"/>
+        </w:rPr>
+        <w:t>System objective under evidence recall and policy constraints.</w:t>
+      </w:r>
+    </w:p>
+    <w:p>
+      <w:pPr>
+        <w:pStyle w:val="Heading2"/>
+        <w:keepNext/>
+      </w:pPr>
+      <w:r>
+        <w:t>Optimization strategy</w:t>
+      </w:r>
+    </w:p>
+    <w:p>
+      <w:pPr>
+        <w:pStyle w:val="ListBullet"/>
+      </w:pPr>
+      <w:r>
+        <w:t>Train positives from question and answer-bearing evidence spans.</w:t>
+      </w:r>
+    </w:p>
+    <w:p>
+      <w:pPr>
+        <w:pStyle w:val="ListBullet"/>
+      </w:pPr>
+      <w:r>
+        <w:t>Mine same-entity wrong-time records as temporal hard negatives.</w:t>
+      </w:r>
+    </w:p>
+    <w:p>
+      <w:pPr>
+        <w:pStyle w:val="ListBullet"/>
+      </w:pPr>
+      <w:r>
+        <w:t>Mine superseded revisions, nearby topics, and list siblings as structured negatives.</w:t>
+      </w:r>
+    </w:p>
+    <w:p>
+      <w:pPr>
+        <w:pStyle w:val="ListBullet"/>
+      </w:pPr>
+      <w:r>
+        <w:t>Filter likely false negatives before contrastive training.</w:t>
+      </w:r>
+    </w:p>
+    <w:p>
+      <w:pPr>
+        <w:pStyle w:val="ListBullet"/>
+      </w:pPr>
+      <w:r>
+        <w:t>Train nested vector dimensions. Select the smallest prefix that holds recall at the release gate.</w:t>
+      </w:r>
+    </w:p>
+    <w:p>
+      <w:pPr>
+        <w:pStyle w:val="ListBullet"/>
+      </w:pPr>
+      <w:r>
+        <w:t>Tune BM25F weight, dense weight, RRF constant, candidate count, and context budget by conversation holdout.</w:t>
+      </w:r>
+    </w:p>
+    <w:p>
+      <w:pPr>
+        <w:pStyle w:val="ListBullet"/>
+      </w:pPr>
+      <w:r>
+        <w:t>Run late interaction on the top 32 candidates. Run a generative or cross-encoder judge on the top 8 only when needed.</w:t>
+      </w:r>
+    </w:p>
+    <w:p>
+      <w:pPr>
+        <w:pStyle w:val="ListBullet"/>
+      </w:pPr>
+      <w:r>
+        <w:t>Optimize answer quality first. Constrain p95 latency, index bytes, embedding cost, evidence recall, and policy safety.</w:t>
+      </w:r>
+    </w:p>
+    <w:p>
+      <w:pPr>
+        <w:pStyle w:val="Heading2"/>
+        <w:keepNext/>
+      </w:pPr>
+      <w:r>
+        <w:t>Completed now</w:t>
+      </w:r>
+    </w:p>
+    <w:p>
+      <w:pPr>
+        <w:pStyle w:val="ListBullet"/>
+      </w:pPr>
+      <w:r>
+        <w:t>[x] Removed evidence_quote from the shared strict extraction schema.</w:t>
+      </w:r>
+    </w:p>
+    <w:p>
+      <w:pPr>
+        <w:pStyle w:val="ListBullet"/>
+      </w:pPr>
+      <w:r>
+        <w:t>[x] Added local exact-value and lexical-clause evidence anchoring.</w:t>
+      </w:r>
+    </w:p>
+    <w:p>
+      <w:pPr>
+        <w:pStyle w:val="ListBullet"/>
+      </w:pPr>
+      <w:r>
+        <w:t>[x] Added one optional bounded evidence pass for unresolved candidates.</w:t>
+      </w:r>
+    </w:p>
+    <w:p>
+      <w:pPr>
+        <w:pStyle w:val="ListBullet"/>
+      </w:pPr>
+      <w:r>
+        <w:t>[x] Added automatic valid-time timeline rendering for temporal questions.</w:t>
+      </w:r>
+    </w:p>
+    <w:p>
+      <w:pPr>
+        <w:pStyle w:val="ListBullet"/>
+      </w:pPr>
+      <w:r>
+        <w:t>[x] Added a disposable field-vector sidecar with atomic persistence.</w:t>
+      </w:r>
+    </w:p>
+    <w:p>
+      <w:pPr>
+        <w:pStyle w:val="ListBullet"/>
+      </w:pPr>
+      <w:r>
+        <w:t>[x] Bound every vector entry to a record revision and embedding model.</w:t>
+      </w:r>
+    </w:p>
+    <w:p>
+      <w:pPr>
+        <w:pStyle w:val="ListBullet"/>
+      </w:pPr>
+      <w:r>
+        <w:t>[x] Added incremental refresh and stale-vector removal.</w:t>
+      </w:r>
+    </w:p>
+    <w:p>
+      <w:pPr>
+        <w:pStyle w:val="ListBullet"/>
+      </w:pPr>
+      <w:r>
+        <w:t>[x] Added policy-first dense search and weighted MaxSim.</w:t>
+      </w:r>
+    </w:p>
+    <w:p>
+      <w:pPr>
+        <w:pStyle w:val="ListBullet"/>
+      </w:pPr>
+      <w:r>
+        <w:t>[x] Added BM25F and semantic reciprocal rank fusion.</w:t>
+      </w:r>
+    </w:p>
+    <w:p>
+      <w:pPr>
+        <w:pStyle w:val="ListBullet"/>
+      </w:pPr>
+      <w:r>
+        <w:t>[x] Added regression tests. The full suite passes with 197 tests and 4 credentialed tests skipped.</w:t>
+      </w:r>
+    </w:p>
+    <w:p>
+      <w:r>
+        <w:t>The next benchmark should run four ablations on the same ten conversations: lean BM25F, lean BM25F plus timeline, hybrid field vectors, and hybrid plus late interaction. Report accuracy, abstention, temporal, multi-hop, single-hop, tokens, p50 latency, p95 latency, and sidecar bytes. Keep multi-hop above 15 percent. Recover the prior 25.4 percent Passport 2 line before accepting another extraction burden.</w:t>
+      </w:r>
+    </w:p>
+    <w:p>
+      <w:pPr>
+        <w:pStyle w:val="Heading2"/>
+        <w:keepNext/>
+      </w:pPr>
+      <w:r>
+        <w:t>Additional primary references</w:t>
+      </w:r>
+    </w:p>
+    <w:p>
+      <w:pPr>
+        <w:spacing w:after="80"/>
+      </w:pPr>
+      <w:r>
+        <w:t>[32] LLM2Vec Large Language Models Are Secretly Powerful Text Encoders. https://arxiv.org/abs/2404.05961</w:t>
+      </w:r>
+    </w:p>
+    <w:p>
+      <w:pPr>
+        <w:spacing w:after="80"/>
+      </w:pPr>
+      <w:r>
+        <w:t>[33] GritLM Generative Representational Instruction Tuning. https://arxiv.org/abs/2402.09906</w:t>
+      </w:r>
+    </w:p>
+    <w:p>
+      <w:pPr>
+        <w:spacing w:after="80"/>
+      </w:pPr>
+      <w:r>
+        <w:t>[34] NV-Embed Improved Techniques for Training LLMs as Generalist Embedding Models. https://arxiv.org/abs/2405.17428</w:t>
+      </w:r>
+    </w:p>
+    <w:p>
+      <w:pPr>
+        <w:spacing w:after="80"/>
+      </w:pPr>
+      <w:r>
+        <w:t>[35] Matryoshka Representation Learning. https://arxiv.org/abs/2205.13147</w:t>
+      </w:r>
+    </w:p>
+    <w:p>
+      <w:pPr>
+        <w:spacing w:after="80"/>
+      </w:pPr>
+      <w:r>
+        <w:t>[36] ColBERT Efficient and Effective Passage Search via Contextualized Late Interaction. https://arxiv.org/abs/2004.12832</w:t>
+      </w:r>
+    </w:p>
+    <w:p>
+      <w:pPr>
+        <w:spacing w:after="80"/>
+      </w:pPr>
+      <w:r>
+        <w:t>[37] ColBERTv2 Effective and Efficient Retrieval via Lightweight Late Interaction. https://arxiv.org/abs/2112.01488</w:t>
+      </w:r>
+    </w:p>
+    <w:p>
+      <w:pPr>
+        <w:spacing w:after="80"/>
+      </w:pPr>
+      <w:r>
+        <w:t>[38] Qwen3 Embedding Advancing Text Embedding and Reranking Through Foundation Models. https://arxiv.org/abs/2506.05176</w:t>
+      </w:r>
+    </w:p>
+    <w:p>
+      <w:pPr>
+        <w:spacing w:after="80"/>
+      </w:pPr>
+      <w:r>
+        <w:t>[39] Robustness Risk of Conversational Retrieval. https://arxiv.org/abs/2604.06176</w:t>
+      </w:r>
+    </w:p>
     <w:sectPr>
       <w:headerReference w:type="default" r:id="rId9"/>
       <w:footerReference w:type="default" r:id="rId10"/>
@@ -18717,7 +19736,7 @@
         <w:color w:val="5B6573"/>
         <w:sz w:val="16"/>
       </w:rPr>
-      <w:t xml:space="preserve">SozoGraph  |  5 September 2026  |  </w:t>
+      <w:t xml:space="preserve">SozoGraph  |  6 September 2026  |  </w:t>
     </w:r>
     <w:r>
       <w:fldChar w:fldCharType="begin"/>

</xml_diff>